<commit_message>
fix(thesis): soften RTX×PRA claims and rebuild Word draft
Align abstract, §2.5, §4.2, and table 6.1 with conservative
cross-model wording (ρ≈+0.66, p≈0.16, n=6, pilot only). Pin
Isaac Sim to 6.0.0-rc.59 in abstract, add PPO/RSL-RL references,
and fix rebuild to remove orphan tables between body replacements.
</commit_message>
<xml_diff>
--- a/thesis/THESIS_DRAFT_FCU_v1.docx
+++ b/thesis/THESIS_DRAFT_FCU_v1.docx
@@ -633,7 +633,7 @@
         </w:rPr>
       </w:pPr>
       <w:r>
-        <w:t>本研究從應用電聲角度，探討室內主動聲學回波特徵能否在可控幾何下支撐趨勢級距離推理。研究平台為 NVIDIA Isaac Sim 6.0 RTX Acoustic，感測器懸掛於 Universal Robots UR10 末端；實驗採固定 TCP、移動目標設計，於 0.5–3.0 m 範圍進行 6×5 次正式擷取，全部通過驗證（30/30 PASS）。結果顯示 primary_sgw_early_energy 優於飽和之振幅峰值作為距離代理（Spearman ρ≈−0.66），且與 PyRoomAcoustics 幾何聲學基線呈趨勢一致（ρ≈+0.66），惟非波形等價。延伸實驗將同一 Geometry Passport 與特徵工廠接入 Isaac Lab：動態場景 128 steps 觀測中，early_energy 與 GT 距離 ρ≈−0.48；Sim 靜態標定訓練之線性回歸於 Lab hold-out 達 MAE≈0.41 m、r≈0.47。in-sim RSL-RL PPO 閉環示範訓練迴路可行，但 hold-out 未優於監督基線（v5 det MAE≈0.44 m）。本研究貢獻為可審計模擬可行性管線與明確 claim boundary，非部署級測距或波形級數位雙生。</w:t>
+        <w:t>本研究從應用電聲角度，探討室內主動聲學回波特徵能否在可控幾何下支撐趨勢級距離推理。研究平台為 NVIDIA Isaac Sim 6.0.0-rc.59 host standalone RTX Acoustic，感測器懸掛於 Universal Robots UR10 末端；實驗採固定 TCP、移動目標設計，於 0.5–3.0 m 範圍進行 6×5 次正式擷取，全部通過驗證（30/30 PASS）。結果顯示 primary_sgw_early_energy 優於飽和之振幅峰值作為距離代理（Spearman ρ≈−0.66, n=6），且與 PyRoomAcoustics early energy 呈中度正相關趨勢（ρ≈+0.66, p≈0.16, n=6），僅作 pilot cross-model characterization，非波形等價。延伸實驗將同一 Geometry Passport 與特徵工廠接入 Isaac Lab：動態場景 128 steps 觀測中，early_energy 與 GT 距離 ρ≈−0.48；Sim 靜態標定訓練之線性回歸於 Lab hold-out 達 MAE≈0.41 m、r≈0.47。in-sim RSL-RL PPO 閉環示範訓練迴路可行，但 hold-out 未優於監督基線（v5 det MAE≈0.44 m）。本研究貢獻為可審計模擬可行性管線與明確 claim boundary，非部署級測距或波形級數位雙生。</w:t>
       </w:r>
     </w:p>
     <w:p>
@@ -808,7 +808,7 @@
         </w:rPr>
       </w:pPr>
       <w:r>
-        <w:t>This thesis examines, from an applied electro-acoustics perspective, whether indoor active acoustic echo features support trend-level distance reasoning under controlled geometry. Using NVIDIA Isaac Sim 6.0 RTX Acoustic on a UR10 end-effector with a fixed-TCP, moving-target protocol, all 30 formal captures (6 distances × 5 repeats) passed validation. primary_sgw_early_energy outperformed saturated amplitude peaks as a distance proxy (Spearman ρ≈−0.66) and trend-matched PyRoomAcoustics (ρ≈+0.66), without waveform equivalence. The same geometry passport and feature factory were extended in Isaac Lab: dynamic observations showed ρ≈−0.48 between early energy and ground-truth distance; Sim-trained linear regression achieved MAE≈0.41 m and r≈0.47 on Lab hold-out. In-simulation RSL-RL PPO demonstrated a feasible closed loop but did not beat the supervised baseline (v5 det MAE≈0.44 m). The contribution is an auditable feasibility pipeline with explicit claim boundaries, not deployment-grade ranging or waveform-faithful digital twins.</w:t>
+        <w:t>This thesis examines, from an applied electro-acoustics perspective, whether indoor active acoustic echo features support trend-level distance reasoning under controlled geometry. Using NVIDIA Isaac Sim 6.0.0-rc.59 host standalone RTX Acoustic on a UR10 end-effector with a fixed-TCP, moving-target protocol, all 30 formal captures (6 distances × 5 repeats) passed validation. primary_sgw_early_energy outperformed saturated amplitude peaks as a distance proxy (Spearman ρ≈−0.66, n=6) and showed a moderate positive trend with PyRoomAcoustics early energy (ρ≈+0.66, p≈0.16, n=6) as pilot cross-model characterization, without waveform equivalence. The same geometry passport and feature factory were extended in Isaac Lab: dynamic observations showed ρ≈−0.48 between early energy and ground-truth distance; Sim-trained linear regression achieved MAE≈0.41 m and r≈0.47 on Lab hold-out. In-simulation RSL-RL PPO demonstrated a feasible closed loop but did not beat the supervised baseline (v5 det MAE≈0.44 m). The contribution is an auditable feasibility pipeline with explicit claim boundaries, not deployment-grade ranging or waveform-faithful digital twins.</w:t>
       </w:r>
     </w:p>
     <w:p>
@@ -1428,7 +1428,7 @@
         <w:pStyle w:val="Content"/>
       </w:pPr>
       <w:r>
-        <w:t>貢獻一（主）：建立 UR10 固定 TCP 下可審計 RTX 聲學管線，完成 30/30 可重複性與 RTX×PRA 趨勢對照。</w:t>
+        <w:t>貢獻一（主）：建立 UR10 固定 TCP 下可審計 RTX 聲學管線，完成 30/30 可重複性與 RTX×PRA pilot 趨勢對照（n=6）。</w:t>
       </w:r>
     </w:p>
     <w:p>
@@ -1604,7 +1604,7 @@
         <w:pStyle w:val="Content"/>
       </w:pPr>
       <w:r>
-        <w:t>在特徵—距離推理文獻方面，dEchorate 資料集（2021）提供標定 RIR 與回波特徵，支撐以聲學摘要特徵進行距離相關學習之可行性。本研究 Phase 3 以 PRA 萃取 early energy、RT60 等與 RTX 同幾何對齊，實證兩者於距離軸上具一致趨勢（Spearman ρ≈0.66），但振幅尺度與飽和行為不同，再次印證「趨勢可對、波形不等」之 claim boundary。</w:t>
+        <w:t>在特徵—距離推理文獻方面，dEchorate 資料集（2021）提供標定 RIR 與回波特徵，支撐以聲學摘要特徵進行距離相關學習之可行性。本研究 Phase 3 以 PRA 萃取 early energy、RT60 等與 RTX 同幾何對齊，於 n=6 距離點觀察到 early energy 中度正相關趨勢（Spearman ρ≈+0.66, p≈0.16），惟樣本數有限且未達顯著，僅作 pilot cross-model characterization；振幅尺度與飽和行為亦不同，再次印證「趨勢可對、波形不等」之 claim boundary。</w:t>
       </w:r>
     </w:p>
     <w:p>
@@ -1680,7 +1680,7 @@
               <a:graphicData uri="http://schemas.openxmlformats.org/drawingml/2006/picture">
                 <pic:pic>
                   <pic:nvPicPr>
-                    <pic:cNvPr id="0" name="fig3_1_research_architecture.png"/>
+                    <pic:cNvPr id="0" name="image.png"/>
                     <pic:cNvPicPr/>
                   </pic:nvPicPr>
                   <pic:blipFill>
@@ -1845,7 +1845,7 @@
         <w:pStyle w:val="Content"/>
       </w:pPr>
       <w:r>
-        <w:t>材質 B、5 repeats 平均：amplitude_max 於 1.0 m 後飽和；primary_sgw_early_energy 與距離 ρ≈−0.66。RTX 與 PRA early energy 趨勢一致（ρ≈+0.66），振幅尺度不同，屬趨勢級對照。</w:t>
+        <w:t>材質 B、5 repeats 平均：amplitude_max 於 1.0 m 後飽和；primary_sgw_early_energy 與距離 ρ≈−0.66（n=6）。RTX 與 PRA early energy 呈中度正相關趨勢（ρ≈+0.66, p≈0.16, n=6），振幅尺度不同；未達統計顯著，僅作 pilot cross-model characterization，非波形等價。</w:t>
       </w:r>
     </w:p>
     <w:p>
@@ -2843,7 +2843,7 @@
         <w:pStyle w:val="Content"/>
       </w:pPr>
       <w:r>
-        <w:t>電聲觀點：室內多徑使距離資訊主要體現在早期能量之弱趨勢，而非 peak 飽和區。模擬觀點：RTX 與 PRA 趨勢可對但模型不同，支持以任務級指標（ρ、CV、PASS）論證可行性。學習觀點：SL 在弱信號下較穩健；RL 低 MAE 需搭配 pred 變異解讀，避免過度宣稱。</w:t>
+        <w:t>電聲觀點：室內多徑使距離資訊主要體現在早期能量之弱趨勢，而非 peak 飽和區。模擬觀點：RTX 與 PRA early energy 於 n=6 呈中度趨勢對應（p≈0.16，未達顯著），模型機制仍不同，支持以任務級指標（ρ、CV、PASS）論證可行性。學習觀點：SL 在弱信號下較穩健；RL 低 MAE 需搭配 pred 變異解讀，避免過度宣稱。</w:t>
       </w:r>
     </w:p>
     <w:p>
@@ -2922,7 +2922,7 @@
           </w:tcPr>
           <w:p>
             <w:r>
-              <w:t>30/30 可重複；early_energy 趨勢；RTX×PRA 趨勢一致</w:t>
+              <w:t>30/30 可重複；early_energy 趨勢；RTX×PRA early energy 中度趨勢（ρ≈+0.66, p≈0.16, n=6, pilot）</w:t>
             </w:r>
           </w:p>
         </w:tc>
@@ -2932,7 +2932,7 @@
           </w:tcPr>
           <w:p>
             <w:r>
-              <w:t>波形等價；厘米級測距</w:t>
+              <w:t>波形等價；跨模型統計顯著一致；厘米級測距</w:t>
             </w:r>
           </w:p>
         </w:tc>
@@ -3051,1379 +3051,6 @@
         <w:t>建議：（1）CH201 實機 task-level 協定；（2）擴大距離／離軸點位以增加 early_energy 動態；（3）特徵工程與不確定性量化；（4）以 replication package 支援口試重現。</w:t>
       </w:r>
     </w:p>
-    <w:bookmarkEnd w:id="13"/>
-    <w:tbl>
-      <w:tblPr>
-        <w:tblW w:type="auto" w:w="0"/>
-        <w:tblLook w:firstColumn="1" w:firstRow="1" w:lastColumn="0" w:lastRow="0" w:noHBand="0" w:noVBand="1" w:val="04A0"/>
-      </w:tblPr>
-      <w:tblGrid>
-        <w:gridCol w:w="1442"/>
-        <w:gridCol w:w="1442"/>
-        <w:gridCol w:w="1442"/>
-        <w:gridCol w:w="1442"/>
-        <w:gridCol w:w="1442"/>
-        <w:gridCol w:w="1442"/>
-      </w:tblGrid>
-      <w:tr>
-        <w:tc>
-          <w:tcPr>
-            <w:tcW w:type="dxa" w:w="1442"/>
-          </w:tcPr>
-          <w:p>
-            <w:r>
-              <w:t>Run</w:t>
-            </w:r>
-          </w:p>
-        </w:tc>
-        <w:tc>
-          <w:tcPr>
-            <w:tcW w:type="dxa" w:w="1442"/>
-          </w:tcPr>
-          <w:p>
-            <w:r>
-              <w:t>Checkpoint</w:t>
-            </w:r>
-          </w:p>
-        </w:tc>
-        <w:tc>
-          <w:tcPr>
-            <w:tcW w:type="dxa" w:w="1442"/>
-          </w:tcPr>
-          <w:p>
-            <w:r>
-              <w:t>模式</w:t>
-            </w:r>
-          </w:p>
-        </w:tc>
-        <w:tc>
-          <w:tcPr>
-            <w:tcW w:type="dxa" w:w="1442"/>
-          </w:tcPr>
-          <w:p>
-            <w:r>
-              <w:t>MAE(m)</w:t>
-            </w:r>
-          </w:p>
-        </w:tc>
-        <w:tc>
-          <w:tcPr>
-            <w:tcW w:type="dxa" w:w="1442"/>
-          </w:tcPr>
-          <w:p>
-            <w:r>
-              <w:t>r(gt,pred)</w:t>
-            </w:r>
-          </w:p>
-        </w:tc>
-        <w:tc>
-          <w:tcPr>
-            <w:tcW w:type="dxa" w:w="1442"/>
-          </w:tcPr>
-          <w:p>
-            <w:r>
-              <w:t>pred mean±std(m)</w:t>
-            </w:r>
-          </w:p>
-        </w:tc>
-      </w:tr>
-      <w:tr>
-        <w:tc>
-          <w:tcPr>
-            <w:tcW w:type="dxa" w:w="1442"/>
-          </w:tcPr>
-          <w:p>
-            <w:r>
-              <w:t>long_v3</w:t>
-            </w:r>
-          </w:p>
-        </w:tc>
-        <w:tc>
-          <w:tcPr>
-            <w:tcW w:type="dxa" w:w="1442"/>
-          </w:tcPr>
-          <w:p>
-            <w:r>
-              <w:t>model_199</w:t>
-            </w:r>
-          </w:p>
-        </w:tc>
-        <w:tc>
-          <w:tcPr>
-            <w:tcW w:type="dxa" w:w="1442"/>
-          </w:tcPr>
-          <w:p>
-            <w:r>
-              <w:t>det</w:t>
-            </w:r>
-          </w:p>
-        </w:tc>
-        <w:tc>
-          <w:tcPr>
-            <w:tcW w:type="dxa" w:w="1442"/>
-          </w:tcPr>
-          <w:p>
-            <w:r>
-              <w:t>0.115</w:t>
-            </w:r>
-          </w:p>
-        </w:tc>
-        <w:tc>
-          <w:tcPr>
-            <w:tcW w:type="dxa" w:w="1442"/>
-          </w:tcPr>
-          <w:p>
-            <w:r>
-              <w:t>0.335</w:t>
-            </w:r>
-          </w:p>
-        </w:tc>
-        <w:tc>
-          <w:tcPr>
-            <w:tcW w:type="dxa" w:w="1442"/>
-          </w:tcPr>
-          <w:p>
-            <w:r>
-              <w:t>1.576±0.000</w:t>
-            </w:r>
-          </w:p>
-        </w:tc>
-      </w:tr>
-      <w:tr>
-        <w:tc>
-          <w:tcPr>
-            <w:tcW w:type="dxa" w:w="1442"/>
-          </w:tcPr>
-          <w:p>
-            <w:r>
-              <w:t>long_v4</w:t>
-            </w:r>
-          </w:p>
-        </w:tc>
-        <w:tc>
-          <w:tcPr>
-            <w:tcW w:type="dxa" w:w="1442"/>
-          </w:tcPr>
-          <w:p>
-            <w:r>
-              <w:t>model_199</w:t>
-            </w:r>
-          </w:p>
-        </w:tc>
-        <w:tc>
-          <w:tcPr>
-            <w:tcW w:type="dxa" w:w="1442"/>
-          </w:tcPr>
-          <w:p>
-            <w:r>
-              <w:t>stoch</w:t>
-            </w:r>
-          </w:p>
-        </w:tc>
-        <w:tc>
-          <w:tcPr>
-            <w:tcW w:type="dxa" w:w="1442"/>
-          </w:tcPr>
-          <w:p>
-            <w:r>
-              <w:t>0.126</w:t>
-            </w:r>
-          </w:p>
-        </w:tc>
-        <w:tc>
-          <w:tcPr>
-            <w:tcW w:type="dxa" w:w="1442"/>
-          </w:tcPr>
-          <w:p>
-            <w:r>
-              <w:t>0.247</w:t>
-            </w:r>
-          </w:p>
-        </w:tc>
-        <w:tc>
-          <w:tcPr>
-            <w:tcW w:type="dxa" w:w="1442"/>
-          </w:tcPr>
-          <w:p>
-            <w:r>
-              <w:t>1.534±0.083</w:t>
-            </w:r>
-          </w:p>
-        </w:tc>
-      </w:tr>
-      <w:tr>
-        <w:tc>
-          <w:tcPr>
-            <w:tcW w:type="dxa" w:w="1442"/>
-          </w:tcPr>
-          <w:p>
-            <w:r>
-              <w:t>long_v5</w:t>
-            </w:r>
-          </w:p>
-        </w:tc>
-        <w:tc>
-          <w:tcPr>
-            <w:tcW w:type="dxa" w:w="1442"/>
-          </w:tcPr>
-          <w:p>
-            <w:r>
-              <w:t>model_499</w:t>
-            </w:r>
-          </w:p>
-        </w:tc>
-        <w:tc>
-          <w:tcPr>
-            <w:tcW w:type="dxa" w:w="1442"/>
-          </w:tcPr>
-          <w:p>
-            <w:r>
-              <w:t>det</w:t>
-            </w:r>
-          </w:p>
-        </w:tc>
-        <w:tc>
-          <w:tcPr>
-            <w:tcW w:type="dxa" w:w="1442"/>
-          </w:tcPr>
-          <w:p>
-            <w:r>
-              <w:t>0.441</w:t>
-            </w:r>
-          </w:p>
-        </w:tc>
-        <w:tc>
-          <w:tcPr>
-            <w:tcW w:type="dxa" w:w="1442"/>
-          </w:tcPr>
-          <w:p>
-            <w:r>
-              <w:t>0.229</w:t>
-            </w:r>
-          </w:p>
-        </w:tc>
-        <w:tc>
-          <w:tcPr>
-            <w:tcW w:type="dxa" w:w="1442"/>
-          </w:tcPr>
-          <w:p>
-            <w:r>
-              <w:t>1.637±0.477</w:t>
-            </w:r>
-          </w:p>
-        </w:tc>
-      </w:tr>
-      <w:tr>
-        <w:tc>
-          <w:tcPr>
-            <w:tcW w:type="dxa" w:w="1442"/>
-          </w:tcPr>
-          <w:p>
-            <w:r>
-              <w:t>long_v5</w:t>
-            </w:r>
-          </w:p>
-        </w:tc>
-        <w:tc>
-          <w:tcPr>
-            <w:tcW w:type="dxa" w:w="1442"/>
-          </w:tcPr>
-          <w:p>
-            <w:r>
-              <w:t>model_499</w:t>
-            </w:r>
-          </w:p>
-        </w:tc>
-        <w:tc>
-          <w:tcPr>
-            <w:tcW w:type="dxa" w:w="1442"/>
-          </w:tcPr>
-          <w:p>
-            <w:r>
-              <w:t>stoch</w:t>
-            </w:r>
-          </w:p>
-        </w:tc>
-        <w:tc>
-          <w:tcPr>
-            <w:tcW w:type="dxa" w:w="1442"/>
-          </w:tcPr>
-          <w:p>
-            <w:r>
-              <w:t>0.457</w:t>
-            </w:r>
-          </w:p>
-        </w:tc>
-        <w:tc>
-          <w:tcPr>
-            <w:tcW w:type="dxa" w:w="1442"/>
-          </w:tcPr>
-          <w:p>
-            <w:r>
-              <w:t>0.078</w:t>
-            </w:r>
-          </w:p>
-        </w:tc>
-        <w:tc>
-          <w:tcPr>
-            <w:tcW w:type="dxa" w:w="1442"/>
-          </w:tcPr>
-          <w:p>
-            <w:r>
-              <w:t>1.559±0.481</w:t>
-            </w:r>
-          </w:p>
-        </w:tc>
-      </w:tr>
-    </w:tbl>
-    <w:tbl>
-      <w:tblPr>
-        <w:tblW w:type="auto" w:w="0"/>
-        <w:tblLook w:firstColumn="1" w:firstRow="1" w:lastColumn="0" w:lastRow="0" w:noHBand="0" w:noVBand="1" w:val="04A0"/>
-      </w:tblPr>
-      <w:tblGrid>
-        <w:gridCol w:w="2163"/>
-        <w:gridCol w:w="2163"/>
-        <w:gridCol w:w="2163"/>
-        <w:gridCol w:w="2163"/>
-      </w:tblGrid>
-      <w:tr>
-        <w:tc>
-          <w:tcPr>
-            <w:tcW w:type="dxa" w:w="2163"/>
-          </w:tcPr>
-          <w:p>
-            <w:r>
-              <w:t>方法</w:t>
-            </w:r>
-          </w:p>
-        </w:tc>
-        <w:tc>
-          <w:tcPr>
-            <w:tcW w:type="dxa" w:w="2163"/>
-          </w:tcPr>
-          <w:p>
-            <w:r>
-              <w:t>MAE (m)</w:t>
-            </w:r>
-          </w:p>
-        </w:tc>
-        <w:tc>
-          <w:tcPr>
-            <w:tcW w:type="dxa" w:w="2163"/>
-          </w:tcPr>
-          <w:p>
-            <w:r>
-              <w:t>Pearson r</w:t>
-            </w:r>
-          </w:p>
-        </w:tc>
-        <w:tc>
-          <w:tcPr>
-            <w:tcW w:type="dxa" w:w="2163"/>
-          </w:tcPr>
-          <w:p>
-            <w:r>
-              <w:t>備註</w:t>
-            </w:r>
-          </w:p>
-        </w:tc>
-      </w:tr>
-      <w:tr>
-        <w:tc>
-          <w:tcPr>
-            <w:tcW w:type="dxa" w:w="2163"/>
-          </w:tcPr>
-          <w:p>
-            <w:r>
-              <w:t>Sim→Lab 線性 SL（§4.6）</w:t>
-            </w:r>
-          </w:p>
-        </w:tc>
-        <w:tc>
-          <w:tcPr>
-            <w:tcW w:type="dxa" w:w="2163"/>
-          </w:tcPr>
-          <w:p>
-            <w:r>
-              <w:t>0.41</w:t>
-            </w:r>
-          </w:p>
-        </w:tc>
-        <w:tc>
-          <w:tcPr>
-            <w:tcW w:type="dxa" w:w="2163"/>
-          </w:tcPr>
-          <w:p>
-            <w:r>
-              <w:t>0.47</w:t>
-            </w:r>
-          </w:p>
-        </w:tc>
-        <w:tc>
-          <w:tcPr>
-            <w:tcW w:type="dxa" w:w="2163"/>
-          </w:tcPr>
-          <w:p>
-            <w:r>
-              <w:t>主學習基線</w:t>
-            </w:r>
-          </w:p>
-        </w:tc>
-      </w:tr>
-      <w:tr>
-        <w:tc>
-          <w:tcPr>
-            <w:tcW w:type="dxa" w:w="2163"/>
-          </w:tcPr>
-          <w:p>
-            <w:r>
-              <w:t>in-sim PPO v3 det</w:t>
-            </w:r>
-          </w:p>
-        </w:tc>
-        <w:tc>
-          <w:tcPr>
-            <w:tcW w:type="dxa" w:w="2163"/>
-          </w:tcPr>
-          <w:p>
-            <w:r>
-              <w:t>0.115</w:t>
-            </w:r>
-          </w:p>
-        </w:tc>
-        <w:tc>
-          <w:tcPr>
-            <w:tcW w:type="dxa" w:w="2163"/>
-          </w:tcPr>
-          <w:p>
-            <w:r>
-              <w:t>0.34</w:t>
-            </w:r>
-          </w:p>
-        </w:tc>
-        <w:tc>
-          <w:tcPr>
-            <w:tcW w:type="dxa" w:w="2163"/>
-          </w:tcPr>
-          <w:p>
-            <w:r>
-              <w:t>pred 近常數</w:t>
-            </w:r>
-          </w:p>
-        </w:tc>
-      </w:tr>
-      <w:tr>
-        <w:tc>
-          <w:tcPr>
-            <w:tcW w:type="dxa" w:w="2163"/>
-          </w:tcPr>
-          <w:p>
-            <w:r>
-              <w:t>in-sim PPO v5 det</w:t>
-            </w:r>
-          </w:p>
-        </w:tc>
-        <w:tc>
-          <w:tcPr>
-            <w:tcW w:type="dxa" w:w="2163"/>
-          </w:tcPr>
-          <w:p>
-            <w:r>
-              <w:t>0.441</w:t>
-            </w:r>
-          </w:p>
-        </w:tc>
-        <w:tc>
-          <w:tcPr>
-            <w:tcW w:type="dxa" w:w="2163"/>
-          </w:tcPr>
-          <w:p>
-            <w:r>
-              <w:t>0.229</w:t>
-            </w:r>
-          </w:p>
-        </w:tc>
-        <w:tc>
-          <w:tcPr>
-            <w:tcW w:type="dxa" w:w="2163"/>
-          </w:tcPr>
-          <w:p>
-            <w:r>
-              <w:t>有變異，未優於 SL</w:t>
-            </w:r>
-          </w:p>
-        </w:tc>
-      </w:tr>
-    </w:tbl>
-    <w:tbl>
-      <w:tblPr>
-        <w:tblW w:type="auto" w:w="0"/>
-        <w:tblLook w:firstColumn="1" w:firstRow="1" w:lastColumn="0" w:lastRow="0" w:noHBand="0" w:noVBand="1" w:val="04A0"/>
-      </w:tblPr>
-      <w:tblGrid>
-        <w:gridCol w:w="1442"/>
-        <w:gridCol w:w="1442"/>
-        <w:gridCol w:w="1442"/>
-        <w:gridCol w:w="1442"/>
-        <w:gridCol w:w="1442"/>
-        <w:gridCol w:w="1442"/>
-      </w:tblGrid>
-      <w:tr>
-        <w:tc>
-          <w:tcPr>
-            <w:tcW w:type="dxa" w:w="1442"/>
-          </w:tcPr>
-          <w:p>
-            <w:r>
-              <w:t>Run</w:t>
-            </w:r>
-          </w:p>
-        </w:tc>
-        <w:tc>
-          <w:tcPr>
-            <w:tcW w:type="dxa" w:w="1442"/>
-          </w:tcPr>
-          <w:p>
-            <w:r>
-              <w:t>Checkpoint</w:t>
-            </w:r>
-          </w:p>
-        </w:tc>
-        <w:tc>
-          <w:tcPr>
-            <w:tcW w:type="dxa" w:w="1442"/>
-          </w:tcPr>
-          <w:p>
-            <w:r>
-              <w:t>模式</w:t>
-            </w:r>
-          </w:p>
-        </w:tc>
-        <w:tc>
-          <w:tcPr>
-            <w:tcW w:type="dxa" w:w="1442"/>
-          </w:tcPr>
-          <w:p>
-            <w:r>
-              <w:t>MAE(m)</w:t>
-            </w:r>
-          </w:p>
-        </w:tc>
-        <w:tc>
-          <w:tcPr>
-            <w:tcW w:type="dxa" w:w="1442"/>
-          </w:tcPr>
-          <w:p>
-            <w:r>
-              <w:t>r(gt,pred)</w:t>
-            </w:r>
-          </w:p>
-        </w:tc>
-        <w:tc>
-          <w:tcPr>
-            <w:tcW w:type="dxa" w:w="1442"/>
-          </w:tcPr>
-          <w:p>
-            <w:r>
-              <w:t>pred mean±std(m)</w:t>
-            </w:r>
-          </w:p>
-        </w:tc>
-      </w:tr>
-      <w:tr>
-        <w:tc>
-          <w:tcPr>
-            <w:tcW w:type="dxa" w:w="1442"/>
-          </w:tcPr>
-          <w:p>
-            <w:r>
-              <w:t>long_v3</w:t>
-            </w:r>
-          </w:p>
-        </w:tc>
-        <w:tc>
-          <w:tcPr>
-            <w:tcW w:type="dxa" w:w="1442"/>
-          </w:tcPr>
-          <w:p>
-            <w:r>
-              <w:t>model_199</w:t>
-            </w:r>
-          </w:p>
-        </w:tc>
-        <w:tc>
-          <w:tcPr>
-            <w:tcW w:type="dxa" w:w="1442"/>
-          </w:tcPr>
-          <w:p>
-            <w:r>
-              <w:t>det</w:t>
-            </w:r>
-          </w:p>
-        </w:tc>
-        <w:tc>
-          <w:tcPr>
-            <w:tcW w:type="dxa" w:w="1442"/>
-          </w:tcPr>
-          <w:p>
-            <w:r>
-              <w:t>0.115</w:t>
-            </w:r>
-          </w:p>
-        </w:tc>
-        <w:tc>
-          <w:tcPr>
-            <w:tcW w:type="dxa" w:w="1442"/>
-          </w:tcPr>
-          <w:p>
-            <w:r>
-              <w:t>0.335</w:t>
-            </w:r>
-          </w:p>
-        </w:tc>
-        <w:tc>
-          <w:tcPr>
-            <w:tcW w:type="dxa" w:w="1442"/>
-          </w:tcPr>
-          <w:p>
-            <w:r>
-              <w:t>1.576±0.000</w:t>
-            </w:r>
-          </w:p>
-        </w:tc>
-      </w:tr>
-      <w:tr>
-        <w:tc>
-          <w:tcPr>
-            <w:tcW w:type="dxa" w:w="1442"/>
-          </w:tcPr>
-          <w:p>
-            <w:r>
-              <w:t>long_v4</w:t>
-            </w:r>
-          </w:p>
-        </w:tc>
-        <w:tc>
-          <w:tcPr>
-            <w:tcW w:type="dxa" w:w="1442"/>
-          </w:tcPr>
-          <w:p>
-            <w:r>
-              <w:t>model_199</w:t>
-            </w:r>
-          </w:p>
-        </w:tc>
-        <w:tc>
-          <w:tcPr>
-            <w:tcW w:type="dxa" w:w="1442"/>
-          </w:tcPr>
-          <w:p>
-            <w:r>
-              <w:t>stoch</w:t>
-            </w:r>
-          </w:p>
-        </w:tc>
-        <w:tc>
-          <w:tcPr>
-            <w:tcW w:type="dxa" w:w="1442"/>
-          </w:tcPr>
-          <w:p>
-            <w:r>
-              <w:t>0.126</w:t>
-            </w:r>
-          </w:p>
-        </w:tc>
-        <w:tc>
-          <w:tcPr>
-            <w:tcW w:type="dxa" w:w="1442"/>
-          </w:tcPr>
-          <w:p>
-            <w:r>
-              <w:t>0.247</w:t>
-            </w:r>
-          </w:p>
-        </w:tc>
-        <w:tc>
-          <w:tcPr>
-            <w:tcW w:type="dxa" w:w="1442"/>
-          </w:tcPr>
-          <w:p>
-            <w:r>
-              <w:t>1.534±0.083</w:t>
-            </w:r>
-          </w:p>
-        </w:tc>
-      </w:tr>
-      <w:tr>
-        <w:tc>
-          <w:tcPr>
-            <w:tcW w:type="dxa" w:w="1442"/>
-          </w:tcPr>
-          <w:p>
-            <w:r>
-              <w:t>long_v5</w:t>
-            </w:r>
-          </w:p>
-        </w:tc>
-        <w:tc>
-          <w:tcPr>
-            <w:tcW w:type="dxa" w:w="1442"/>
-          </w:tcPr>
-          <w:p>
-            <w:r>
-              <w:t>model_499</w:t>
-            </w:r>
-          </w:p>
-        </w:tc>
-        <w:tc>
-          <w:tcPr>
-            <w:tcW w:type="dxa" w:w="1442"/>
-          </w:tcPr>
-          <w:p>
-            <w:r>
-              <w:t>det</w:t>
-            </w:r>
-          </w:p>
-        </w:tc>
-        <w:tc>
-          <w:tcPr>
-            <w:tcW w:type="dxa" w:w="1442"/>
-          </w:tcPr>
-          <w:p>
-            <w:r>
-              <w:t>0.441</w:t>
-            </w:r>
-          </w:p>
-        </w:tc>
-        <w:tc>
-          <w:tcPr>
-            <w:tcW w:type="dxa" w:w="1442"/>
-          </w:tcPr>
-          <w:p>
-            <w:r>
-              <w:t>0.229</w:t>
-            </w:r>
-          </w:p>
-        </w:tc>
-        <w:tc>
-          <w:tcPr>
-            <w:tcW w:type="dxa" w:w="1442"/>
-          </w:tcPr>
-          <w:p>
-            <w:r>
-              <w:t>1.637±0.477</w:t>
-            </w:r>
-          </w:p>
-        </w:tc>
-      </w:tr>
-      <w:tr>
-        <w:tc>
-          <w:tcPr>
-            <w:tcW w:type="dxa" w:w="1442"/>
-          </w:tcPr>
-          <w:p>
-            <w:r>
-              <w:t>long_v5</w:t>
-            </w:r>
-          </w:p>
-        </w:tc>
-        <w:tc>
-          <w:tcPr>
-            <w:tcW w:type="dxa" w:w="1442"/>
-          </w:tcPr>
-          <w:p>
-            <w:r>
-              <w:t>model_499</w:t>
-            </w:r>
-          </w:p>
-        </w:tc>
-        <w:tc>
-          <w:tcPr>
-            <w:tcW w:type="dxa" w:w="1442"/>
-          </w:tcPr>
-          <w:p>
-            <w:r>
-              <w:t>stoch</w:t>
-            </w:r>
-          </w:p>
-        </w:tc>
-        <w:tc>
-          <w:tcPr>
-            <w:tcW w:type="dxa" w:w="1442"/>
-          </w:tcPr>
-          <w:p>
-            <w:r>
-              <w:t>0.457</w:t>
-            </w:r>
-          </w:p>
-        </w:tc>
-        <w:tc>
-          <w:tcPr>
-            <w:tcW w:type="dxa" w:w="1442"/>
-          </w:tcPr>
-          <w:p>
-            <w:r>
-              <w:t>0.078</w:t>
-            </w:r>
-          </w:p>
-        </w:tc>
-        <w:tc>
-          <w:tcPr>
-            <w:tcW w:type="dxa" w:w="1442"/>
-          </w:tcPr>
-          <w:p>
-            <w:r>
-              <w:t>1.559±0.481</w:t>
-            </w:r>
-          </w:p>
-        </w:tc>
-      </w:tr>
-    </w:tbl>
-    <w:tbl>
-      <w:tblPr>
-        <w:tblW w:type="auto" w:w="0"/>
-        <w:tblLook w:firstColumn="1" w:firstRow="1" w:lastColumn="0" w:lastRow="0" w:noHBand="0" w:noVBand="1" w:val="04A0"/>
-      </w:tblPr>
-      <w:tblGrid>
-        <w:gridCol w:w="2163"/>
-        <w:gridCol w:w="2163"/>
-        <w:gridCol w:w="2163"/>
-        <w:gridCol w:w="2163"/>
-      </w:tblGrid>
-      <w:tr>
-        <w:tc>
-          <w:tcPr>
-            <w:tcW w:type="dxa" w:w="2163"/>
-          </w:tcPr>
-          <w:p>
-            <w:r>
-              <w:t>方法</w:t>
-            </w:r>
-          </w:p>
-        </w:tc>
-        <w:tc>
-          <w:tcPr>
-            <w:tcW w:type="dxa" w:w="2163"/>
-          </w:tcPr>
-          <w:p>
-            <w:r>
-              <w:t>MAE (m)</w:t>
-            </w:r>
-          </w:p>
-        </w:tc>
-        <w:tc>
-          <w:tcPr>
-            <w:tcW w:type="dxa" w:w="2163"/>
-          </w:tcPr>
-          <w:p>
-            <w:r>
-              <w:t>Pearson r</w:t>
-            </w:r>
-          </w:p>
-        </w:tc>
-        <w:tc>
-          <w:tcPr>
-            <w:tcW w:type="dxa" w:w="2163"/>
-          </w:tcPr>
-          <w:p>
-            <w:r>
-              <w:t>備註</w:t>
-            </w:r>
-          </w:p>
-        </w:tc>
-      </w:tr>
-      <w:tr>
-        <w:tc>
-          <w:tcPr>
-            <w:tcW w:type="dxa" w:w="2163"/>
-          </w:tcPr>
-          <w:p>
-            <w:r>
-              <w:t>Sim→Lab 線性 SL（§4.6）</w:t>
-            </w:r>
-          </w:p>
-        </w:tc>
-        <w:tc>
-          <w:tcPr>
-            <w:tcW w:type="dxa" w:w="2163"/>
-          </w:tcPr>
-          <w:p>
-            <w:r>
-              <w:t>0.41</w:t>
-            </w:r>
-          </w:p>
-        </w:tc>
-        <w:tc>
-          <w:tcPr>
-            <w:tcW w:type="dxa" w:w="2163"/>
-          </w:tcPr>
-          <w:p>
-            <w:r>
-              <w:t>0.47</w:t>
-            </w:r>
-          </w:p>
-        </w:tc>
-        <w:tc>
-          <w:tcPr>
-            <w:tcW w:type="dxa" w:w="2163"/>
-          </w:tcPr>
-          <w:p>
-            <w:r>
-              <w:t>主學習基線</w:t>
-            </w:r>
-          </w:p>
-        </w:tc>
-      </w:tr>
-      <w:tr>
-        <w:tc>
-          <w:tcPr>
-            <w:tcW w:type="dxa" w:w="2163"/>
-          </w:tcPr>
-          <w:p>
-            <w:r>
-              <w:t>in-sim PPO v3 det</w:t>
-            </w:r>
-          </w:p>
-        </w:tc>
-        <w:tc>
-          <w:tcPr>
-            <w:tcW w:type="dxa" w:w="2163"/>
-          </w:tcPr>
-          <w:p>
-            <w:r>
-              <w:t>0.115</w:t>
-            </w:r>
-          </w:p>
-        </w:tc>
-        <w:tc>
-          <w:tcPr>
-            <w:tcW w:type="dxa" w:w="2163"/>
-          </w:tcPr>
-          <w:p>
-            <w:r>
-              <w:t>0.34</w:t>
-            </w:r>
-          </w:p>
-        </w:tc>
-        <w:tc>
-          <w:tcPr>
-            <w:tcW w:type="dxa" w:w="2163"/>
-          </w:tcPr>
-          <w:p>
-            <w:r>
-              <w:t>pred 近常數</w:t>
-            </w:r>
-          </w:p>
-        </w:tc>
-      </w:tr>
-      <w:tr>
-        <w:tc>
-          <w:tcPr>
-            <w:tcW w:type="dxa" w:w="2163"/>
-          </w:tcPr>
-          <w:p>
-            <w:r>
-              <w:t>in-sim PPO v5 det</w:t>
-            </w:r>
-          </w:p>
-        </w:tc>
-        <w:tc>
-          <w:tcPr>
-            <w:tcW w:type="dxa" w:w="2163"/>
-          </w:tcPr>
-          <w:p>
-            <w:r>
-              <w:t>0.441</w:t>
-            </w:r>
-          </w:p>
-        </w:tc>
-        <w:tc>
-          <w:tcPr>
-            <w:tcW w:type="dxa" w:w="2163"/>
-          </w:tcPr>
-          <w:p>
-            <w:r>
-              <w:t>0.229</w:t>
-            </w:r>
-          </w:p>
-        </w:tc>
-        <w:tc>
-          <w:tcPr>
-            <w:tcW w:type="dxa" w:w="2163"/>
-          </w:tcPr>
-          <w:p>
-            <w:r>
-              <w:t>有變異，未優於 SL</w:t>
-            </w:r>
-          </w:p>
-        </w:tc>
-      </w:tr>
-    </w:tbl>
-    <w:tbl>
-      <w:tblPr>
-        <w:tblW w:type="auto" w:w="0"/>
-        <w:tblLook w:firstColumn="1" w:firstRow="1" w:lastColumn="0" w:lastRow="0" w:noHBand="0" w:noVBand="1" w:val="04A0"/>
-      </w:tblPr>
-      <w:tblGrid>
-        <w:gridCol w:w="4326"/>
-        <w:gridCol w:w="4326"/>
-      </w:tblGrid>
-      <w:tr>
-        <w:tc>
-          <w:tcPr>
-            <w:tcW w:type="dxa" w:w="4326"/>
-          </w:tcPr>
-          <w:p>
-            <w:r>
-              <w:t>參數</w:t>
-            </w:r>
-          </w:p>
-        </w:tc>
-        <w:tc>
-          <w:tcPr>
-            <w:tcW w:type="dxa" w:w="4326"/>
-          </w:tcPr>
-          <w:p>
-            <w:r>
-              <w:t>數值</w:t>
-            </w:r>
-          </w:p>
-        </w:tc>
-      </w:tr>
-      <w:tr>
-        <w:tc>
-          <w:tcPr>
-            <w:tcW w:type="dxa" w:w="4326"/>
-          </w:tcPr>
-          <w:p>
-            <w:r>
-              <w:t>房間尺寸</w:t>
-            </w:r>
-          </w:p>
-        </w:tc>
-        <w:tc>
-          <w:tcPr>
-            <w:tcW w:type="dxa" w:w="4326"/>
-          </w:tcPr>
-          <w:p>
-            <w:r>
-              <w:t>4.5×3.0×2.8 m</w:t>
-            </w:r>
-          </w:p>
-        </w:tc>
-      </w:tr>
-      <w:tr>
-        <w:tc>
-          <w:tcPr>
-            <w:tcW w:type="dxa" w:w="4326"/>
-          </w:tcPr>
-          <w:p>
-            <w:r>
-              <w:t>Sensor 位置</w:t>
-            </w:r>
-          </w:p>
-        </w:tc>
-        <w:tc>
-          <w:tcPr>
-            <w:tcW w:type="dxa" w:w="4326"/>
-          </w:tcPr>
-          <w:p>
-            <w:r>
-              <w:t>(0.80, 0.16, 0.65) m</w:t>
-            </w:r>
-          </w:p>
-        </w:tc>
-      </w:tr>
-      <w:tr>
-        <w:tc>
-          <w:tcPr>
-            <w:tcW w:type="dxa" w:w="4326"/>
-          </w:tcPr>
-          <w:p>
-            <w:r>
-              <w:t>距離點</w:t>
-            </w:r>
-          </w:p>
-        </w:tc>
-        <w:tc>
-          <w:tcPr>
-            <w:tcW w:type="dxa" w:w="4326"/>
-          </w:tcPr>
-          <w:p>
-            <w:r>
-              <w:t>0.5–3.0 m</w:t>
-            </w:r>
-          </w:p>
-        </w:tc>
-      </w:tr>
-      <w:tr>
-        <w:tc>
-          <w:tcPr>
-            <w:tcW w:type="dxa" w:w="4326"/>
-          </w:tcPr>
-          <w:p>
-            <w:r>
-              <w:t>中心頻率</w:t>
-            </w:r>
-          </w:p>
-        </w:tc>
-        <w:tc>
-          <w:tcPr>
-            <w:tcW w:type="dxa" w:w="4326"/>
-          </w:tcPr>
-          <w:p>
-            <w:r>
-              <w:t>40 kHz</w:t>
-            </w:r>
-          </w:p>
-        </w:tc>
-      </w:tr>
-      <w:tr>
-        <w:tc>
-          <w:tcPr>
-            <w:tcW w:type="dxa" w:w="4326"/>
-          </w:tcPr>
-          <w:p>
-            <w:r>
-              <w:t>正式 runs</w:t>
-            </w:r>
-          </w:p>
-        </w:tc>
-        <w:tc>
-          <w:tcPr>
-            <w:tcW w:type="dxa" w:w="4326"/>
-          </w:tcPr>
-          <w:p>
-            <w:r>
-              <w:t>30 (6×5)</w:t>
-            </w:r>
-          </w:p>
-        </w:tc>
-      </w:tr>
-    </w:tbl>
-    <w:tbl>
-      <w:tblPr>
-        <w:tblW w:type="auto" w:w="0"/>
-        <w:tblLook w:firstColumn="1" w:firstRow="1" w:lastColumn="0" w:lastRow="0" w:noHBand="0" w:noVBand="1" w:val="04A0"/>
-      </w:tblPr>
-      <w:tblGrid>
-        <w:gridCol w:w="2163"/>
-        <w:gridCol w:w="2163"/>
-        <w:gridCol w:w="2163"/>
-        <w:gridCol w:w="2163"/>
-      </w:tblGrid>
-      <w:tr>
-        <w:tc>
-          <w:tcPr>
-            <w:tcW w:type="dxa" w:w="2163"/>
-          </w:tcPr>
-          <w:p>
-            <w:r>
-              <w:t>距離(m)</w:t>
-            </w:r>
-          </w:p>
-        </w:tc>
-        <w:tc>
-          <w:tcPr>
-            <w:tcW w:type="dxa" w:w="2163"/>
-          </w:tcPr>
-          <w:p>
-            <w:r>
-              <w:t>RTX early_energy</w:t>
-            </w:r>
-          </w:p>
-        </w:tc>
-        <w:tc>
-          <w:tcPr>
-            <w:tcW w:type="dxa" w:w="2163"/>
-          </w:tcPr>
-          <w:p>
-            <w:r>
-              <w:t>RTX amp_max</w:t>
-            </w:r>
-          </w:p>
-        </w:tc>
-        <w:tc>
-          <w:tcPr>
-            <w:tcW w:type="dxa" w:w="2163"/>
-          </w:tcPr>
-          <w:p>
-            <w:r>
-              <w:t>PRA early_50ms</w:t>
-            </w:r>
-          </w:p>
-        </w:tc>
-      </w:tr>
-      <w:tr>
-        <w:tc>
-          <w:tcPr>
-            <w:tcW w:type="dxa" w:w="2163"/>
-          </w:tcPr>
-          <w:p>
-            <w:r>
-              <w:t>0.5</w:t>
-            </w:r>
-          </w:p>
-        </w:tc>
-        <w:tc>
-          <w:tcPr>
-            <w:tcW w:type="dxa" w:w="2163"/>
-          </w:tcPr>
-          <w:p>
-            <w:r>
-              <w:t>167.2</w:t>
-            </w:r>
-          </w:p>
-        </w:tc>
-        <w:tc>
-          <w:tcPr>
-            <w:tcW w:type="dxa" w:w="2163"/>
-          </w:tcPr>
-          <w:p>
-            <w:r>
-              <w:t>4822</w:t>
-            </w:r>
-          </w:p>
-        </w:tc>
-        <w:tc>
-          <w:tcPr>
-            <w:tcW w:type="dxa" w:w="2163"/>
-          </w:tcPr>
-          <w:p>
-            <w:r>
-              <w:t>7.31</w:t>
-            </w:r>
-          </w:p>
-        </w:tc>
-      </w:tr>
-      <w:tr>
-        <w:tc>
-          <w:tcPr>
-            <w:tcW w:type="dxa" w:w="2163"/>
-          </w:tcPr>
-          <w:p>
-            <w:r>
-              <w:t>1.0</w:t>
-            </w:r>
-          </w:p>
-        </w:tc>
-        <w:tc>
-          <w:tcPr>
-            <w:tcW w:type="dxa" w:w="2163"/>
-          </w:tcPr>
-          <w:p>
-            <w:r>
-              <w:t>163.0</w:t>
-            </w:r>
-          </w:p>
-        </w:tc>
-        <w:tc>
-          <w:tcPr>
-            <w:tcW w:type="dxa" w:w="2163"/>
-          </w:tcPr>
-          <w:p>
-            <w:r>
-              <w:t>5171</w:t>
-            </w:r>
-          </w:p>
-        </w:tc>
-        <w:tc>
-          <w:tcPr>
-            <w:tcW w:type="dxa" w:w="2163"/>
-          </w:tcPr>
-          <w:p>
-            <w:r>
-              <w:t>2.98</w:t>
-            </w:r>
-          </w:p>
-        </w:tc>
-      </w:tr>
-      <w:tr>
-        <w:tc>
-          <w:tcPr>
-            <w:tcW w:type="dxa" w:w="2163"/>
-          </w:tcPr>
-          <w:p>
-            <w:r>
-              <w:t>2.0</w:t>
-            </w:r>
-          </w:p>
-        </w:tc>
-        <w:tc>
-          <w:tcPr>
-            <w:tcW w:type="dxa" w:w="2163"/>
-          </w:tcPr>
-          <w:p>
-            <w:r>
-              <w:t>156.3</w:t>
-            </w:r>
-          </w:p>
-        </w:tc>
-        <w:tc>
-          <w:tcPr>
-            <w:tcW w:type="dxa" w:w="2163"/>
-          </w:tcPr>
-          <w:p>
-            <w:r>
-              <w:t>5171</w:t>
-            </w:r>
-          </w:p>
-        </w:tc>
-        <w:tc>
-          <w:tcPr>
-            <w:tcW w:type="dxa" w:w="2163"/>
-          </w:tcPr>
-          <w:p>
-            <w:r>
-              <w:t>1.50</w:t>
-            </w:r>
-          </w:p>
-        </w:tc>
-      </w:tr>
-      <w:tr>
-        <w:tc>
-          <w:tcPr>
-            <w:tcW w:type="dxa" w:w="2163"/>
-          </w:tcPr>
-          <w:p>
-            <w:r>
-              <w:t>3.0</w:t>
-            </w:r>
-          </w:p>
-        </w:tc>
-        <w:tc>
-          <w:tcPr>
-            <w:tcW w:type="dxa" w:w="2163"/>
-          </w:tcPr>
-          <w:p>
-            <w:r>
-              <w:t>156.3</w:t>
-            </w:r>
-          </w:p>
-        </w:tc>
-        <w:tc>
-          <w:tcPr>
-            <w:tcW w:type="dxa" w:w="2163"/>
-          </w:tcPr>
-          <w:p>
-            <w:r>
-              <w:t>5171</w:t>
-            </w:r>
-          </w:p>
-        </w:tc>
-        <w:tc>
-          <w:tcPr>
-            <w:tcW w:type="dxa" w:w="2163"/>
-          </w:tcPr>
-          <w:p>
-            <w:r>
-              <w:t>1.14</w:t>
-            </w:r>
-          </w:p>
-        </w:tc>
-      </w:tr>
-    </w:tbl>
     <w:p>
       <w:pPr>
         <w:pStyle w:val="Header1"/>
@@ -4498,6 +3125,15 @@
         <w:br/>
         <w:br/>
         <w:t>Zhou, Z., Chen, X., Li, Y., &amp; Wang, Y. (2024). Towards building AI-CPS with NVIDIA Isaac Sim for industrial manipulation. In Proceedings of the 2024 ACM/IEEE International Conference on Model-Driven Engineering Software and Systems (MSEC) (pp. 1–8). https://doi.org/10.1145/3639477.3639740</w:t>
+        <w:br/>
+        <w:br/>
+        <w:t>NVIDIA. (2026d). Isaac Lab documentation (v3.0.0-beta2). https://isaac-sim.github.io/IsaacLab/</w:t>
+        <w:br/>
+        <w:br/>
+        <w:t>Rudin, N., Hoeller, D., Reist, P., &amp; Hutter, M. (2022). Learning to walk in minutes using massively parallel deep reinforcement learning. In Proceedings of the 6th Conference on Robot Learning (pp. 604–623).</w:t>
+        <w:br/>
+        <w:br/>
+        <w:t>Schulman, J., Wolski, F., Dhariwal, P., Radford, A., &amp; Klimov, O. (2017). Proximal policy optimization algorithms. arXiv:1707.06347. https://doi.org/10.48550/arXiv.1707.06347</w:t>
       </w:r>
     </w:p>
     <w:sectPr>

</xml_diff>